<commit_message>
Razonamientos de los algoritmos.
</commit_message>
<xml_diff>
--- a/p2/P2.docx
+++ b/p2/P2.docx
@@ -1,6 +1,6 @@
 
 <file path=word/document.xml><?xml version="1.0" encoding="utf-8"?>
-<w:document xmlns:wpc="http://schemas.microsoft.com/office/word/2010/wordprocessingCanvas" xmlns:cx="http://schemas.microsoft.com/office/drawing/2014/chartex" xmlns:cx1="http://schemas.microsoft.com/office/drawing/2015/9/8/chartex" xmlns:mc="http://schemas.openxmlformats.org/markup-compatibility/2006" xmlns:o="urn:schemas-microsoft-com:office:office" xmlns:r="http://schemas.openxmlformats.org/officeDocument/2006/relationships" xmlns:m="http://schemas.openxmlformats.org/officeDocument/2006/math" xmlns:v="urn:schemas-microsoft-com:vml" xmlns:wp14="http://schemas.microsoft.com/office/word/2010/wordprocessingDrawing" xmlns:wp="http://schemas.openxmlformats.org/drawingml/2006/wordprocessingDrawing" xmlns:w10="urn:schemas-microsoft-com:office:word" xmlns:w="http://schemas.openxmlformats.org/wordprocessingml/2006/main" xmlns:w14="http://schemas.microsoft.com/office/word/2010/wordml" xmlns:w15="http://schemas.microsoft.com/office/word/2012/wordml" xmlns:w16se="http://schemas.microsoft.com/office/word/2015/wordml/symex" xmlns:wpg="http://schemas.microsoft.com/office/word/2010/wordprocessingGroup" xmlns:wpi="http://schemas.microsoft.com/office/word/2010/wordprocessingInk" xmlns:wne="http://schemas.microsoft.com/office/word/2006/wordml" xmlns:wps="http://schemas.microsoft.com/office/word/2010/wordprocessingShape" mc:Ignorable="w14 w15 w16se wp14">
+<w:document xmlns:wpc="http://schemas.microsoft.com/office/word/2010/wordprocessingCanvas" xmlns:cx="http://schemas.microsoft.com/office/drawing/2014/chartex" xmlns:mc="http://schemas.openxmlformats.org/markup-compatibility/2006" xmlns:o="urn:schemas-microsoft-com:office:office" xmlns:r="http://schemas.openxmlformats.org/officeDocument/2006/relationships" xmlns:m="http://schemas.openxmlformats.org/officeDocument/2006/math" xmlns:v="urn:schemas-microsoft-com:vml" xmlns:wp14="http://schemas.microsoft.com/office/word/2010/wordprocessingDrawing" xmlns:wp="http://schemas.openxmlformats.org/drawingml/2006/wordprocessingDrawing" xmlns:w10="urn:schemas-microsoft-com:office:word" xmlns:w="http://schemas.openxmlformats.org/wordprocessingml/2006/main" xmlns:w14="http://schemas.microsoft.com/office/word/2010/wordml" xmlns:w15="http://schemas.microsoft.com/office/word/2012/wordml" xmlns:w16se="http://schemas.microsoft.com/office/word/2015/wordml/symex" xmlns:wpg="http://schemas.microsoft.com/office/word/2010/wordprocessingGroup" xmlns:wpi="http://schemas.microsoft.com/office/word/2010/wordprocessingInk" xmlns:wne="http://schemas.microsoft.com/office/word/2006/wordml" xmlns:wps="http://schemas.microsoft.com/office/word/2010/wordprocessingShape" mc:Ignorable="w14 w15 w16se wp14">
   <w:body>
     <w:p>
       <w:pPr>
@@ -7725,44 +7725,6 @@
     <w:p>
       <w:pPr>
         <w:rPr>
-          <w:b/>
-          <w:color w:val="FF0000"/>
-          <w:sz w:val="24"/>
-          <w:szCs w:val="24"/>
-        </w:rPr>
-      </w:pPr>
-      <w:r>
-        <w:rPr>
-          <w:b/>
-          <w:color w:val="FF0000"/>
-          <w:sz w:val="24"/>
-          <w:szCs w:val="24"/>
-        </w:rPr>
-        <w:t>Decir cómo se debería comportar cada algoritmo en función de si esta ordenado el vector que se le pasa o no.</w:t>
-      </w:r>
-    </w:p>
-    <w:p>
-      <w:pPr>
-        <w:rPr>
-          <w:b/>
-          <w:color w:val="FF0000"/>
-          <w:sz w:val="24"/>
-          <w:szCs w:val="24"/>
-        </w:rPr>
-      </w:pPr>
-      <w:r>
-        <w:rPr>
-          <w:b/>
-          <w:color w:val="FF0000"/>
-          <w:sz w:val="24"/>
-          <w:szCs w:val="24"/>
-        </w:rPr>
-        <w:t>Hacer el opcional.</w:t>
-      </w:r>
-    </w:p>
-    <w:p>
-      <w:pPr>
-        <w:rPr>
           <w:sz w:val="26"/>
           <w:szCs w:val="26"/>
         </w:rPr>
@@ -8696,34 +8658,31 @@
     <w:p>
       <w:pPr>
         <w:rPr>
-          <w:b/>
-          <w:sz w:val="26"/>
-          <w:szCs w:val="26"/>
+          <w:sz w:val="24"/>
+          <w:szCs w:val="24"/>
         </w:rPr>
       </w:pPr>
       <w:r>
         <w:rPr>
-          <w:b/>
-          <w:sz w:val="26"/>
-          <w:szCs w:val="26"/>
-        </w:rPr>
-        <w:t>Razone si los diferentes tiempos obtenidos concue</w:t>
-      </w:r>
-      <w:r>
-        <w:rPr>
-          <w:b/>
-          <w:sz w:val="26"/>
-          <w:szCs w:val="26"/>
-        </w:rPr>
-        <w:t xml:space="preserve">rdan con lo esperado, según la </w:t>
-      </w:r>
-      <w:r>
-        <w:rPr>
-          <w:b/>
-          <w:sz w:val="26"/>
-          <w:szCs w:val="26"/>
-        </w:rPr>
-        <w:t>complejidad temporal estudiada.</w:t>
+          <w:sz w:val="24"/>
+          <w:szCs w:val="24"/>
+        </w:rPr>
+        <w:t>El algoritmo Burbuja no varía su complejidad en función de si sus elementos están ordenados o no, siempre es O(n</w:t>
+      </w:r>
+      <w:r>
+        <w:rPr>
+          <w:sz w:val="24"/>
+          <w:szCs w:val="24"/>
+          <w:vertAlign w:val="superscript"/>
+        </w:rPr>
+        <w:t>2</w:t>
+      </w:r>
+      <w:r>
+        <w:rPr>
+          <w:sz w:val="24"/>
+          <w:szCs w:val="24"/>
+        </w:rPr>
+        <w:t>).</w:t>
       </w:r>
     </w:p>
     <w:p>
@@ -8734,6 +8693,66 @@
           <w:szCs w:val="26"/>
         </w:rPr>
       </w:pPr>
+      <w:r>
+        <w:rPr>
+          <w:b/>
+          <w:sz w:val="26"/>
+          <w:szCs w:val="26"/>
+        </w:rPr>
+        <w:t>Razone si los diferentes tiempos obtenidos concue</w:t>
+      </w:r>
+      <w:r>
+        <w:rPr>
+          <w:b/>
+          <w:sz w:val="26"/>
+          <w:szCs w:val="26"/>
+        </w:rPr>
+        <w:t xml:space="preserve">rdan con lo esperado, según la </w:t>
+      </w:r>
+      <w:r>
+        <w:rPr>
+          <w:b/>
+          <w:sz w:val="26"/>
+          <w:szCs w:val="26"/>
+        </w:rPr>
+        <w:t>complejidad temporal estudiada.</w:t>
+      </w:r>
+    </w:p>
+    <w:p>
+      <w:pPr>
+        <w:rPr>
+          <w:sz w:val="24"/>
+          <w:szCs w:val="26"/>
+        </w:rPr>
+      </w:pPr>
+      <w:r>
+        <w:rPr>
+          <w:sz w:val="24"/>
+          <w:szCs w:val="26"/>
+        </w:rPr>
+        <w:t xml:space="preserve">Los tiempos obtenidos concuerdan con lo esperado según la complejidad teórica del algoritmo burbuja. </w:t>
+      </w:r>
+      <w:r>
+        <w:rPr>
+          <w:sz w:val="24"/>
+          <w:szCs w:val="26"/>
+        </w:rPr>
+        <w:t>Al</w:t>
+      </w:r>
+      <w:r>
+        <w:rPr>
+          <w:sz w:val="24"/>
+          <w:szCs w:val="26"/>
+        </w:rPr>
+        <w:t xml:space="preserve"> duplicar el tamaño del problema el tiempo se multiplica aproximadamente por cuatro, lo que indica un comportamiento cuadrático</w:t>
+      </w:r>
+      <w:r>
+        <w:rPr>
+          <w:sz w:val="24"/>
+          <w:szCs w:val="26"/>
+        </w:rPr>
+        <w:t>.</w:t>
+      </w:r>
     </w:p>
     <w:p>
       <w:pPr>
@@ -8992,7 +9011,7 @@
                 <w:sz w:val="26"/>
                 <w:szCs w:val="26"/>
               </w:rPr>
-              <w:t>0</w:t>
+              <w:t>349</w:t>
             </w:r>
           </w:p>
         </w:tc>
@@ -9084,7 +9103,7 @@
                 <w:sz w:val="26"/>
                 <w:szCs w:val="26"/>
               </w:rPr>
-              <w:t>0</w:t>
+              <w:t>1401</w:t>
             </w:r>
           </w:p>
         </w:tc>
@@ -9176,7 +9195,7 @@
                 <w:sz w:val="26"/>
                 <w:szCs w:val="26"/>
               </w:rPr>
-              <w:t>0</w:t>
+              <w:t>5616</w:t>
             </w:r>
           </w:p>
         </w:tc>
@@ -9268,7 +9287,7 @@
                 <w:sz w:val="26"/>
                 <w:szCs w:val="26"/>
               </w:rPr>
-              <w:t>0</w:t>
+              <w:t>22053</w:t>
             </w:r>
           </w:p>
         </w:tc>
@@ -9360,7 +9379,7 @@
                 <w:sz w:val="26"/>
                 <w:szCs w:val="26"/>
               </w:rPr>
-              <w:t>0</w:t>
+              <w:t>88122</w:t>
             </w:r>
           </w:p>
         </w:tc>
@@ -9674,34 +9693,59 @@
     <w:p>
       <w:pPr>
         <w:rPr>
-          <w:b/>
-          <w:sz w:val="26"/>
-          <w:szCs w:val="26"/>
+          <w:sz w:val="24"/>
+          <w:szCs w:val="2"/>
         </w:rPr>
       </w:pPr>
       <w:r>
         <w:rPr>
-          <w:b/>
-          <w:sz w:val="26"/>
-          <w:szCs w:val="26"/>
-        </w:rPr>
-        <w:t>Razone si los diferentes tiempos obtenidos concue</w:t>
-      </w:r>
-      <w:r>
-        <w:rPr>
-          <w:b/>
-          <w:sz w:val="26"/>
-          <w:szCs w:val="26"/>
-        </w:rPr>
-        <w:t xml:space="preserve">rdan con lo esperado, según la </w:t>
-      </w:r>
-      <w:r>
-        <w:rPr>
-          <w:b/>
-          <w:sz w:val="26"/>
-          <w:szCs w:val="26"/>
-        </w:rPr>
-        <w:t>complejidad temporal estudiada.</w:t>
+          <w:sz w:val="24"/>
+          <w:szCs w:val="2"/>
+        </w:rPr>
+        <w:t xml:space="preserve">El algoritmo </w:t>
+      </w:r>
+      <w:r>
+        <w:rPr>
+          <w:sz w:val="24"/>
+          <w:szCs w:val="2"/>
+        </w:rPr>
+        <w:t>de Selección es como el Burbuja,</w:t>
+      </w:r>
+      <w:r>
+        <w:rPr>
+          <w:sz w:val="24"/>
+          <w:szCs w:val="2"/>
+        </w:rPr>
+        <w:t xml:space="preserve"> no varía su complejidad en función de si sus elementos están ordenados </w:t>
+      </w:r>
+      <w:r>
+        <w:rPr>
+          <w:sz w:val="24"/>
+          <w:szCs w:val="2"/>
+        </w:rPr>
+        <w:t>o no y</w:t>
+      </w:r>
+      <w:r>
+        <w:rPr>
+          <w:sz w:val="24"/>
+          <w:szCs w:val="2"/>
+        </w:rPr>
+        <w:t xml:space="preserve"> siempre es O(n</w:t>
+      </w:r>
+      <w:r>
+        <w:rPr>
+          <w:sz w:val="24"/>
+          <w:szCs w:val="2"/>
+          <w:vertAlign w:val="superscript"/>
+        </w:rPr>
+        <w:t>2</w:t>
+      </w:r>
+      <w:r>
+        <w:rPr>
+          <w:sz w:val="24"/>
+          <w:szCs w:val="2"/>
+        </w:rPr>
+        <w:t>).</w:t>
       </w:r>
     </w:p>
     <w:p>
@@ -9712,33 +9756,74 @@
           <w:szCs w:val="26"/>
         </w:rPr>
       </w:pPr>
+      <w:r>
+        <w:rPr>
+          <w:b/>
+          <w:sz w:val="26"/>
+          <w:szCs w:val="26"/>
+        </w:rPr>
+        <w:t>Razone si los diferentes tiempos obtenidos concue</w:t>
+      </w:r>
+      <w:r>
+        <w:rPr>
+          <w:b/>
+          <w:sz w:val="26"/>
+          <w:szCs w:val="26"/>
+        </w:rPr>
+        <w:t xml:space="preserve">rdan con lo esperado, según la </w:t>
+      </w:r>
+      <w:r>
+        <w:rPr>
+          <w:b/>
+          <w:sz w:val="26"/>
+          <w:szCs w:val="26"/>
+        </w:rPr>
+        <w:t>complejidad temporal estudiada.</w:t>
+      </w:r>
     </w:p>
     <w:p>
       <w:pPr>
         <w:rPr>
-          <w:b/>
-          <w:sz w:val="26"/>
+          <w:sz w:val="24"/>
           <w:szCs w:val="26"/>
         </w:rPr>
       </w:pPr>
-    </w:p>
-    <w:p>
-      <w:pPr>
-        <w:rPr>
-          <w:b/>
-          <w:sz w:val="26"/>
-          <w:szCs w:val="26"/>
-        </w:rPr>
-      </w:pPr>
-    </w:p>
-    <w:p>
-      <w:pPr>
-        <w:rPr>
-          <w:b/>
-          <w:sz w:val="26"/>
-          <w:szCs w:val="26"/>
-        </w:rPr>
-      </w:pPr>
+      <w:r>
+        <w:rPr>
+          <w:sz w:val="24"/>
+          <w:szCs w:val="26"/>
+        </w:rPr>
+        <w:lastRenderedPageBreak/>
+        <w:t xml:space="preserve">Los tiempos obtenidos concuerdan con la complejidad teórica del algoritmo </w:t>
+      </w:r>
+      <w:r>
+        <w:rPr>
+          <w:sz w:val="24"/>
+          <w:szCs w:val="26"/>
+        </w:rPr>
+        <w:t>Selección</w:t>
+      </w:r>
+      <w:r>
+        <w:rPr>
+          <w:sz w:val="24"/>
+          <w:szCs w:val="26"/>
+        </w:rPr>
+        <w:t xml:space="preserve">. </w:t>
+      </w:r>
+      <w:r>
+        <w:rPr>
+          <w:sz w:val="24"/>
+          <w:szCs w:val="26"/>
+        </w:rPr>
+        <w:t xml:space="preserve">Al </w:t>
+      </w:r>
+      <w:r>
+        <w:rPr>
+          <w:sz w:val="24"/>
+          <w:szCs w:val="26"/>
+        </w:rPr>
+        <w:t>duplicar el tamaño del problema el tiempo se multiplica aproximadamente por cuatro, lo que indica un comportamiento cuadrático</w:t>
+      </w:r>
     </w:p>
     <w:p>
       <w:pPr>
@@ -10679,42 +10764,38 @@
     <w:p>
       <w:pPr>
         <w:rPr>
-          <w:b/>
-          <w:sz w:val="26"/>
-          <w:szCs w:val="26"/>
+          <w:sz w:val="24"/>
+          <w:szCs w:val="24"/>
         </w:rPr>
       </w:pPr>
       <w:r>
         <w:rPr>
-          <w:b/>
-          <w:sz w:val="26"/>
-          <w:szCs w:val="26"/>
-        </w:rPr>
-        <w:t>Razone si los diferentes tiempos obtenidos concue</w:t>
-      </w:r>
-      <w:r>
-        <w:rPr>
-          <w:b/>
-          <w:sz w:val="26"/>
-          <w:szCs w:val="26"/>
-        </w:rPr>
-        <w:t xml:space="preserve">rdan con lo esperado, según la </w:t>
-      </w:r>
-      <w:r>
-        <w:rPr>
-          <w:b/>
-          <w:sz w:val="26"/>
-          <w:szCs w:val="26"/>
-        </w:rPr>
-        <w:t>complejidad temporal estudiada</w:t>
-      </w:r>
-      <w:r>
-        <w:rPr>
-          <w:b/>
-          <w:sz w:val="26"/>
-          <w:szCs w:val="26"/>
-        </w:rPr>
-        <w:t>.</w:t>
+          <w:sz w:val="24"/>
+          <w:szCs w:val="24"/>
+        </w:rPr>
+        <w:t>La complejidad del algoritmo de inserción varía si sus elementos están ordenados o no. El mejor caso es cuando el vector esta ordenado, ya que cada elemento se compara solo una vez con el anterior, dando una complejidad O(n), mientras que, si está desordenado o inversamente ordenado, la complejidad es O(n</w:t>
+      </w:r>
+      <w:r>
+        <w:rPr>
+          <w:sz w:val="24"/>
+          <w:szCs w:val="24"/>
+          <w:vertAlign w:val="superscript"/>
+        </w:rPr>
+        <w:t>2</w:t>
+      </w:r>
+      <w:r>
+        <w:rPr>
+          <w:sz w:val="24"/>
+          <w:szCs w:val="24"/>
+        </w:rPr>
+        <w:t>), ya que cuando esta desordenado cada elemento se compara con la mitad de los elementos anteriores</w:t>
+      </w:r>
+      <w:r>
+        <w:rPr>
+          <w:sz w:val="24"/>
+          <w:szCs w:val="24"/>
+        </w:rPr>
+        <w:t>, y cuando esta inversamente ordenado se compara con todos los elementos anteriores, siendo este el peor caso.</w:t>
       </w:r>
     </w:p>
     <w:p>
@@ -10725,76 +10806,123 @@
           <w:szCs w:val="26"/>
         </w:rPr>
       </w:pPr>
+      <w:r>
+        <w:rPr>
+          <w:b/>
+          <w:sz w:val="26"/>
+          <w:szCs w:val="26"/>
+        </w:rPr>
+        <w:t>Razone si los diferentes tiempos obtenidos concue</w:t>
+      </w:r>
+      <w:r>
+        <w:rPr>
+          <w:b/>
+          <w:sz w:val="26"/>
+          <w:szCs w:val="26"/>
+        </w:rPr>
+        <w:t xml:space="preserve">rdan con lo esperado, según la </w:t>
+      </w:r>
+      <w:r>
+        <w:rPr>
+          <w:b/>
+          <w:sz w:val="26"/>
+          <w:szCs w:val="26"/>
+        </w:rPr>
+        <w:t>complejidad temporal estudiada</w:t>
+      </w:r>
+      <w:r>
+        <w:rPr>
+          <w:b/>
+          <w:sz w:val="26"/>
+          <w:szCs w:val="26"/>
+        </w:rPr>
+        <w:t>.</w:t>
+      </w:r>
     </w:p>
     <w:p>
       <w:pPr>
         <w:rPr>
-          <w:b/>
-          <w:sz w:val="26"/>
+          <w:sz w:val="24"/>
           <w:szCs w:val="26"/>
         </w:rPr>
       </w:pPr>
       <w:r>
         <w:rPr>
-          <w:b/>
-          <w:sz w:val="26"/>
-          <w:szCs w:val="26"/>
-        </w:rPr>
-        <w:t xml:space="preserve">SE LE PIDE: </w:t>
-      </w:r>
-      <w:r>
-        <w:rPr>
-          <w:b/>
-          <w:sz w:val="26"/>
-          <w:szCs w:val="26"/>
-        </w:rPr>
-        <w:t>Implementar una clase RapidoTiempos.java que</w:t>
-      </w:r>
-      <w:r>
-        <w:rPr>
-          <w:b/>
-          <w:sz w:val="26"/>
-          <w:szCs w:val="26"/>
-        </w:rPr>
-        <w:t xml:space="preserve"> tras ser ejecutada sirva para </w:t>
-      </w:r>
-      <w:r>
-        <w:rPr>
-          <w:b/>
-          <w:sz w:val="26"/>
-          <w:szCs w:val="26"/>
-        </w:rPr>
-        <w:t>rellenar la siguiente tabla</w:t>
-      </w:r>
-      <w:r>
-        <w:rPr>
-          <w:b/>
-          <w:sz w:val="26"/>
-          <w:szCs w:val="26"/>
-        </w:rPr>
-        <w:t xml:space="preserve"> (tabla 4):</w:t>
+          <w:sz w:val="24"/>
+          <w:szCs w:val="26"/>
+        </w:rPr>
+        <w:t>Los resultados concuerdan perfectam</w:t>
+      </w:r>
+      <w:r>
+        <w:rPr>
+          <w:sz w:val="24"/>
+          <w:szCs w:val="26"/>
+        </w:rPr>
+        <w:t>ente con la complejidad teórica, ya que en el caso en el que el vector está ordenado, el crecimiento es lineal, y en los demás casos el crecimiento es cuadrático, teniendo tiempos más grandes en el peor caso, el inversamente ordenado.</w:t>
       </w:r>
     </w:p>
     <w:p>
       <w:pPr>
         <w:rPr>
+          <w:b/>
           <w:sz w:val="26"/>
           <w:szCs w:val="26"/>
         </w:rPr>
       </w:pPr>
       <w:r>
         <w:rPr>
-          <w:sz w:val="26"/>
-          <w:szCs w:val="26"/>
-        </w:rPr>
-        <w:t>Parámetro usado: 1</w:t>
-      </w:r>
-      <w:r>
-        <w:rPr>
-          <w:sz w:val="26"/>
-          <w:szCs w:val="26"/>
-        </w:rPr>
-        <w:t>0</w:t>
+          <w:b/>
+          <w:sz w:val="26"/>
+          <w:szCs w:val="26"/>
+        </w:rPr>
+        <w:t xml:space="preserve">SE LE PIDE: </w:t>
+      </w:r>
+      <w:r>
+        <w:rPr>
+          <w:b/>
+          <w:sz w:val="26"/>
+          <w:szCs w:val="26"/>
+        </w:rPr>
+        <w:t>Implementar una clase RapidoTiempos.java que</w:t>
+      </w:r>
+      <w:r>
+        <w:rPr>
+          <w:b/>
+          <w:sz w:val="26"/>
+          <w:szCs w:val="26"/>
+        </w:rPr>
+        <w:t xml:space="preserve"> tras ser ejecutada sirva para </w:t>
+      </w:r>
+      <w:r>
+        <w:rPr>
+          <w:b/>
+          <w:sz w:val="26"/>
+          <w:szCs w:val="26"/>
+        </w:rPr>
+        <w:t>rellenar la siguiente tabla</w:t>
+      </w:r>
+      <w:r>
+        <w:rPr>
+          <w:b/>
+          <w:sz w:val="26"/>
+          <w:szCs w:val="26"/>
+        </w:rPr>
+        <w:t xml:space="preserve"> (tabla 4):</w:t>
+      </w:r>
+    </w:p>
+    <w:p>
+      <w:pPr>
+        <w:rPr>
+          <w:sz w:val="26"/>
+          <w:szCs w:val="26"/>
+        </w:rPr>
+      </w:pPr>
+      <w:r>
+        <w:rPr>
+          <w:sz w:val="26"/>
+          <w:szCs w:val="26"/>
+        </w:rPr>
+        <w:t>Parámetro usado: 10</w:t>
       </w:r>
     </w:p>
     <w:tbl>
@@ -11486,6 +11614,7 @@
                 <w:sz w:val="26"/>
                 <w:szCs w:val="26"/>
               </w:rPr>
+              <w:lastRenderedPageBreak/>
               <w:t>6400</w:t>
             </w:r>
             <w:r>
@@ -11664,34 +11793,54 @@
     <w:p>
       <w:pPr>
         <w:rPr>
-          <w:b/>
-          <w:sz w:val="26"/>
-          <w:szCs w:val="26"/>
+          <w:sz w:val="24"/>
+          <w:szCs w:val="24"/>
         </w:rPr>
       </w:pPr>
       <w:r>
         <w:rPr>
-          <w:b/>
-          <w:sz w:val="26"/>
-          <w:szCs w:val="26"/>
-        </w:rPr>
-        <w:t>Razone si los diferentes tiempos obtenidos concue</w:t>
-      </w:r>
-      <w:r>
-        <w:rPr>
-          <w:b/>
-          <w:sz w:val="26"/>
-          <w:szCs w:val="26"/>
-        </w:rPr>
-        <w:t xml:space="preserve">rdan con lo esperado, según la </w:t>
-      </w:r>
-      <w:r>
-        <w:rPr>
-          <w:b/>
-          <w:sz w:val="26"/>
-          <w:szCs w:val="26"/>
-        </w:rPr>
-        <w:t>complejidad temporal estudiada.</w:t>
+          <w:sz w:val="24"/>
+          <w:szCs w:val="24"/>
+        </w:rPr>
+        <w:t xml:space="preserve">Este algoritmo obtiene una complejidad quasi-lineal en los tres casos, cuando esta ordenado, aleatorio o inversamente ordenado, teniendo casi siempre una complejidad de </w:t>
+      </w:r>
+      <w:proofErr w:type="gramStart"/>
+      <w:r>
+        <w:rPr>
+          <w:sz w:val="24"/>
+          <w:szCs w:val="24"/>
+        </w:rPr>
+        <w:t>O(</w:t>
+      </w:r>
+      <w:proofErr w:type="gramEnd"/>
+      <w:r>
+        <w:rPr>
+          <w:sz w:val="24"/>
+          <w:szCs w:val="24"/>
+        </w:rPr>
+        <w:t xml:space="preserve">n logn), </w:t>
+      </w:r>
+      <w:r>
+        <w:rPr>
+          <w:sz w:val="24"/>
+          <w:szCs w:val="24"/>
+        </w:rPr>
+        <w:t>ya que elige el pivote central y evita particiones degeneradas. El único caso en el que la complejidad puede ser peor es cuando el pivote es el elemento más pequeño o el más grande, dando una complejidad O(n</w:t>
+      </w:r>
+      <w:r>
+        <w:rPr>
+          <w:sz w:val="24"/>
+          <w:szCs w:val="24"/>
+          <w:vertAlign w:val="superscript"/>
+        </w:rPr>
+        <w:t>2</w:t>
+      </w:r>
+      <w:r>
+        <w:rPr>
+          <w:sz w:val="24"/>
+          <w:szCs w:val="24"/>
+        </w:rPr>
+        <w:t>).</w:t>
       </w:r>
     </w:p>
     <w:p>
@@ -11702,79 +11851,88 @@
           <w:szCs w:val="26"/>
         </w:rPr>
       </w:pPr>
+      <w:r>
+        <w:rPr>
+          <w:b/>
+          <w:sz w:val="26"/>
+          <w:szCs w:val="26"/>
+        </w:rPr>
+        <w:t>Razone si los diferentes tiempos obtenidos concue</w:t>
+      </w:r>
+      <w:r>
+        <w:rPr>
+          <w:b/>
+          <w:sz w:val="26"/>
+          <w:szCs w:val="26"/>
+        </w:rPr>
+        <w:t xml:space="preserve">rdan con lo esperado, según la </w:t>
+      </w:r>
+      <w:r>
+        <w:rPr>
+          <w:b/>
+          <w:sz w:val="26"/>
+          <w:szCs w:val="26"/>
+        </w:rPr>
+        <w:t>complejidad temporal estudiada.</w:t>
+      </w:r>
     </w:p>
     <w:p>
       <w:pPr>
         <w:rPr>
-          <w:b/>
-          <w:sz w:val="26"/>
+          <w:sz w:val="24"/>
           <w:szCs w:val="26"/>
         </w:rPr>
       </w:pPr>
       <w:r>
         <w:rPr>
-          <w:b/>
-          <w:sz w:val="26"/>
-          <w:szCs w:val="26"/>
-        </w:rPr>
-        <w:t>Proyecte, a partir de las complejidades y los datos de l</w:t>
-      </w:r>
-      <w:r>
-        <w:rPr>
-          <w:b/>
-          <w:sz w:val="26"/>
-          <w:szCs w:val="26"/>
-        </w:rPr>
-        <w:t xml:space="preserve">as tablas anteriores, ¿cuántos </w:t>
-      </w:r>
-      <w:r>
-        <w:rPr>
-          <w:b/>
-          <w:sz w:val="26"/>
-          <w:szCs w:val="26"/>
-        </w:rPr>
-        <w:t xml:space="preserve">días (1 día= 861400.000 milisegundos) tardaría </w:t>
-      </w:r>
-      <w:r>
-        <w:rPr>
-          <w:b/>
-          <w:sz w:val="26"/>
-          <w:szCs w:val="26"/>
-        </w:rPr>
-        <w:t xml:space="preserve">cada uno de los cuatro métodos </w:t>
-      </w:r>
-      <w:r>
-        <w:rPr>
-          <w:b/>
-          <w:sz w:val="26"/>
-          <w:szCs w:val="26"/>
-        </w:rPr>
-        <w:t>(Burbuja, Selección, Inserción y Rápido) en ordenar</w:t>
-      </w:r>
-      <w:r>
-        <w:rPr>
-          <w:b/>
-          <w:sz w:val="26"/>
-          <w:szCs w:val="26"/>
-        </w:rPr>
-        <w:t xml:space="preserve"> un vector </w:t>
-      </w:r>
-      <w:r>
-        <w:rPr>
-          <w:b/>
-          <w:sz w:val="26"/>
-          <w:szCs w:val="26"/>
-        </w:rPr>
-        <w:lastRenderedPageBreak/>
-        <w:t>de n= 811920.000 (o sea, n=80000*24*2</w:t>
-      </w:r>
-      <w:r>
-        <w:rPr>
-          <w:b/>
-          <w:sz w:val="26"/>
-          <w:szCs w:val="26"/>
-        </w:rPr>
-        <w:t>6=80000*210), en el caso inicialmente en orden aleatorio?</w:t>
+          <w:sz w:val="24"/>
+          <w:szCs w:val="26"/>
+        </w:rPr>
+        <w:t>Los resultados experimentales concuerdan con la complejidad teórica del</w:t>
+      </w:r>
+      <w:r>
+        <w:rPr>
+          <w:sz w:val="24"/>
+          <w:szCs w:val="26"/>
+        </w:rPr>
+        <w:t xml:space="preserve"> algoritmo implementado, ya que e</w:t>
+      </w:r>
+      <w:r>
+        <w:rPr>
+          <w:sz w:val="24"/>
+          <w:szCs w:val="26"/>
+        </w:rPr>
+        <w:t>l tiempo crece aproximadamente por un factor cercano a 2 al duplicar n</w:t>
+      </w:r>
+      <w:r>
+        <w:rPr>
+          <w:sz w:val="24"/>
+          <w:szCs w:val="26"/>
+        </w:rPr>
+        <w:t xml:space="preserve"> (comportamiento de la complejidad </w:t>
+      </w:r>
+      <w:proofErr w:type="gramStart"/>
+      <w:r>
+        <w:rPr>
+          <w:sz w:val="24"/>
+          <w:szCs w:val="24"/>
+        </w:rPr>
+        <w:t>O(</w:t>
+      </w:r>
+      <w:proofErr w:type="gramEnd"/>
+      <w:r>
+        <w:rPr>
+          <w:sz w:val="24"/>
+          <w:szCs w:val="24"/>
+        </w:rPr>
+        <w:t>n logn)</w:t>
+      </w:r>
+      <w:r>
+        <w:rPr>
+          <w:sz w:val="24"/>
+          <w:szCs w:val="24"/>
+        </w:rPr>
+        <w:t>), presentando en los tres casos tiempos similares.</w:t>
       </w:r>
     </w:p>
     <w:p>
@@ -11785,24 +11943,765 @@
           <w:szCs w:val="26"/>
         </w:rPr>
       </w:pPr>
+      <w:r>
+        <w:rPr>
+          <w:b/>
+          <w:sz w:val="26"/>
+          <w:szCs w:val="26"/>
+        </w:rPr>
+        <w:t>Proyecte, a partir de las complejidades y los datos de l</w:t>
+      </w:r>
+      <w:r>
+        <w:rPr>
+          <w:b/>
+          <w:sz w:val="26"/>
+          <w:szCs w:val="26"/>
+        </w:rPr>
+        <w:t xml:space="preserve">as tablas anteriores, ¿cuántos </w:t>
+      </w:r>
+      <w:r>
+        <w:rPr>
+          <w:b/>
+          <w:sz w:val="26"/>
+          <w:szCs w:val="26"/>
+        </w:rPr>
+        <w:t xml:space="preserve">días (1 día= 861400.000 milisegundos) tardaría </w:t>
+      </w:r>
+      <w:r>
+        <w:rPr>
+          <w:b/>
+          <w:sz w:val="26"/>
+          <w:szCs w:val="26"/>
+        </w:rPr>
+        <w:t xml:space="preserve">cada uno de los cuatro métodos </w:t>
+      </w:r>
+      <w:r>
+        <w:rPr>
+          <w:b/>
+          <w:sz w:val="26"/>
+          <w:szCs w:val="26"/>
+        </w:rPr>
+        <w:t>(Burbuja, Selección, Inserción y Rápido) en ordenar</w:t>
+      </w:r>
+      <w:r>
+        <w:rPr>
+          <w:b/>
+          <w:sz w:val="26"/>
+          <w:szCs w:val="26"/>
+        </w:rPr>
+        <w:t xml:space="preserve"> un vector de n= 811920.000 (o sea, n=80000*24*2</w:t>
+      </w:r>
+      <w:r>
+        <w:rPr>
+          <w:b/>
+          <w:sz w:val="26"/>
+          <w:szCs w:val="26"/>
+        </w:rPr>
+        <w:t>6=80000*210), en el caso inicialmente en orden aleatorio?</w:t>
+      </w:r>
     </w:p>
     <w:p>
       <w:pPr>
         <w:rPr>
-          <w:b/>
-          <w:sz w:val="26"/>
+          <w:sz w:val="24"/>
           <w:szCs w:val="26"/>
         </w:rPr>
       </w:pPr>
+      <w:r>
+        <w:rPr>
+          <w:sz w:val="24"/>
+          <w:szCs w:val="26"/>
+        </w:rPr>
+        <w:t>Tomando</w:t>
+      </w:r>
+      <w:r>
+        <w:rPr>
+          <w:sz w:val="24"/>
+          <w:szCs w:val="26"/>
+        </w:rPr>
+        <w:t xml:space="preserve"> como referencia n₀ = 160 000 (último valor ant</w:t>
+      </w:r>
+      <w:r>
+        <w:rPr>
+          <w:sz w:val="24"/>
+          <w:szCs w:val="26"/>
+        </w:rPr>
+        <w:t xml:space="preserve">es de </w:t>
+      </w:r>
+      <w:proofErr w:type="spellStart"/>
+      <w:r>
+        <w:rPr>
+          <w:sz w:val="24"/>
+          <w:szCs w:val="26"/>
+        </w:rPr>
+        <w:t>Fdt</w:t>
+      </w:r>
+      <w:proofErr w:type="spellEnd"/>
+      <w:r>
+        <w:rPr>
+          <w:sz w:val="24"/>
+          <w:szCs w:val="26"/>
+        </w:rPr>
+        <w:t xml:space="preserve"> en varios algoritmos), nuestro n ahora es 811920000​, por lo que aumentamos n en un factor de </w:t>
+      </w:r>
+      <w:r>
+        <w:rPr>
+          <w:sz w:val="24"/>
+          <w:szCs w:val="26"/>
+        </w:rPr>
+        <w:t>5074.5</w:t>
+      </w:r>
+      <w:r>
+        <w:rPr>
+          <w:sz w:val="24"/>
+          <w:szCs w:val="26"/>
+        </w:rPr>
+        <w:t>.</w:t>
+      </w:r>
     </w:p>
     <w:p>
       <w:pPr>
         <w:rPr>
-          <w:b/>
-          <w:sz w:val="26"/>
+          <w:sz w:val="24"/>
           <w:szCs w:val="26"/>
         </w:rPr>
       </w:pPr>
+      <w:r>
+        <w:rPr>
+          <w:sz w:val="24"/>
+          <w:szCs w:val="26"/>
+        </w:rPr>
+        <w:t>Para el algoritmo Burbuja, al ser cuadrático, como t</w:t>
+      </w:r>
+      <w:r>
+        <w:rPr>
+          <w:sz w:val="24"/>
+          <w:szCs w:val="26"/>
+          <w:vertAlign w:val="subscript"/>
+        </w:rPr>
+        <w:t>0</w:t>
+      </w:r>
+      <w:r>
+        <w:rPr>
+          <w:sz w:val="24"/>
+          <w:szCs w:val="26"/>
+        </w:rPr>
+        <w:t>=</w:t>
+      </w:r>
+      <w:r>
+        <w:t xml:space="preserve"> </w:t>
+      </w:r>
+      <w:r>
+        <w:rPr>
+          <w:sz w:val="24"/>
+          <w:szCs w:val="26"/>
+        </w:rPr>
+        <w:t>22190</w:t>
+      </w:r>
+      <w:r>
+        <w:rPr>
+          <w:sz w:val="24"/>
+          <w:szCs w:val="26"/>
+        </w:rPr>
+        <w:t xml:space="preserve">ms, </w:t>
+      </w:r>
+      <w:r>
+        <w:rPr>
+          <w:sz w:val="24"/>
+          <w:szCs w:val="26"/>
+        </w:rPr>
+        <w:t>t=t</w:t>
+      </w:r>
+      <w:r>
+        <w:rPr>
+          <w:sz w:val="24"/>
+          <w:szCs w:val="26"/>
+          <w:vertAlign w:val="subscript"/>
+        </w:rPr>
+        <w:t>0</w:t>
+      </w:r>
+      <w:r>
+        <w:rPr>
+          <w:sz w:val="24"/>
+          <w:szCs w:val="26"/>
+        </w:rPr>
+        <w:t>​</w:t>
+      </w:r>
+      <w:r>
+        <w:rPr>
+          <w:rFonts w:ascii="Cambria Math" w:hAnsi="Cambria Math" w:cs="Cambria Math"/>
+          <w:sz w:val="24"/>
+          <w:szCs w:val="26"/>
+        </w:rPr>
+        <w:t>⋅</w:t>
+      </w:r>
+      <w:r>
+        <w:rPr>
+          <w:sz w:val="24"/>
+          <w:szCs w:val="26"/>
+        </w:rPr>
+        <w:t>k</w:t>
+      </w:r>
+      <w:r>
+        <w:rPr>
+          <w:sz w:val="24"/>
+          <w:szCs w:val="26"/>
+          <w:vertAlign w:val="superscript"/>
+        </w:rPr>
+        <w:t>2</w:t>
+      </w:r>
+      <w:r>
+        <w:rPr>
+          <w:sz w:val="24"/>
+          <w:szCs w:val="26"/>
+        </w:rPr>
+        <w:t>, con k</w:t>
+      </w:r>
+      <w:r>
+        <w:rPr>
+          <w:sz w:val="24"/>
+          <w:szCs w:val="26"/>
+          <w:vertAlign w:val="superscript"/>
+        </w:rPr>
+        <w:t>2</w:t>
+      </w:r>
+      <w:r>
+        <w:rPr>
+          <w:sz w:val="24"/>
+          <w:szCs w:val="26"/>
+        </w:rPr>
+        <w:t>=</w:t>
+      </w:r>
+      <w:r>
+        <w:rPr>
+          <w:sz w:val="24"/>
+          <w:szCs w:val="26"/>
+        </w:rPr>
+        <w:t>25750000</w:t>
+      </w:r>
+      <w:r>
+        <w:rPr>
+          <w:sz w:val="24"/>
+          <w:szCs w:val="26"/>
+        </w:rPr>
+        <w:t>, por lo que t = 5,</w:t>
+      </w:r>
+      <w:r>
+        <w:rPr>
+          <w:sz w:val="24"/>
+          <w:szCs w:val="26"/>
+        </w:rPr>
+        <w:t>71×10</w:t>
+      </w:r>
+      <w:r>
+        <w:rPr>
+          <w:sz w:val="24"/>
+          <w:szCs w:val="26"/>
+          <w:vertAlign w:val="superscript"/>
+        </w:rPr>
+        <w:t>12</w:t>
+      </w:r>
+      <w:r>
+        <w:rPr>
+          <w:sz w:val="24"/>
+          <w:szCs w:val="26"/>
+        </w:rPr>
+        <w:t xml:space="preserve"> ms</w:t>
+      </w:r>
+      <w:r>
+        <w:rPr>
+          <w:sz w:val="24"/>
+          <w:szCs w:val="26"/>
+        </w:rPr>
+        <w:t xml:space="preserve"> o aproximadamente 66300 días.</w:t>
+      </w:r>
+    </w:p>
+    <w:p>
+      <w:pPr>
+        <w:rPr>
+          <w:sz w:val="24"/>
+          <w:szCs w:val="26"/>
+        </w:rPr>
+      </w:pPr>
+      <w:r>
+        <w:rPr>
+          <w:sz w:val="24"/>
+          <w:szCs w:val="26"/>
+        </w:rPr>
+        <w:t xml:space="preserve">Para el algoritmo de selección el cálculo es el mismo, solo que ahora </w:t>
+      </w:r>
+      <w:r>
+        <w:rPr>
+          <w:sz w:val="24"/>
+          <w:szCs w:val="26"/>
+        </w:rPr>
+        <w:t>t</w:t>
+      </w:r>
+      <w:r>
+        <w:rPr>
+          <w:sz w:val="24"/>
+          <w:szCs w:val="26"/>
+          <w:vertAlign w:val="subscript"/>
+        </w:rPr>
+        <w:t>0</w:t>
+      </w:r>
+      <w:r>
+        <w:rPr>
+          <w:sz w:val="24"/>
+          <w:szCs w:val="26"/>
+        </w:rPr>
+        <w:t>=</w:t>
+      </w:r>
+      <w:r>
+        <w:t xml:space="preserve"> </w:t>
+      </w:r>
+      <w:r>
+        <w:rPr>
+          <w:sz w:val="24"/>
+          <w:szCs w:val="26"/>
+        </w:rPr>
+        <w:t>100765 m</w:t>
+      </w:r>
+      <w:r>
+        <w:rPr>
+          <w:sz w:val="24"/>
+          <w:szCs w:val="26"/>
+        </w:rPr>
+        <w:t>s, por lo que t = 2,59</w:t>
+      </w:r>
+      <w:r>
+        <w:rPr>
+          <w:sz w:val="24"/>
+          <w:szCs w:val="26"/>
+        </w:rPr>
+        <w:t>×10</w:t>
+      </w:r>
+      <w:r>
+        <w:rPr>
+          <w:sz w:val="24"/>
+          <w:szCs w:val="26"/>
+          <w:vertAlign w:val="superscript"/>
+        </w:rPr>
+        <w:t>12</w:t>
+      </w:r>
+      <w:r>
+        <w:rPr>
+          <w:sz w:val="24"/>
+          <w:szCs w:val="26"/>
+        </w:rPr>
+        <w:t xml:space="preserve"> ms</w:t>
+      </w:r>
+      <w:r>
+        <w:rPr>
+          <w:sz w:val="24"/>
+          <w:szCs w:val="26"/>
+        </w:rPr>
+        <w:t xml:space="preserve"> o aproximadamente </w:t>
+      </w:r>
+      <w:r>
+        <w:rPr>
+          <w:sz w:val="24"/>
+          <w:szCs w:val="26"/>
+        </w:rPr>
+        <w:t>30100</w:t>
+      </w:r>
+      <w:r>
+        <w:rPr>
+          <w:sz w:val="24"/>
+          <w:szCs w:val="26"/>
+        </w:rPr>
+        <w:t xml:space="preserve"> días.</w:t>
+      </w:r>
+    </w:p>
+    <w:p>
+      <w:pPr>
+        <w:rPr>
+          <w:sz w:val="24"/>
+          <w:szCs w:val="26"/>
+        </w:rPr>
+      </w:pPr>
+      <w:r>
+        <w:rPr>
+          <w:sz w:val="24"/>
+          <w:szCs w:val="26"/>
+        </w:rPr>
+        <w:br/>
+        <w:t xml:space="preserve">Para el algoritmo de inserción en el caso de un vector aleatorio, la complejidad es la misma, por lo que el cálculo es el mismo pero con </w:t>
+      </w:r>
+      <w:r>
+        <w:rPr>
+          <w:sz w:val="24"/>
+          <w:szCs w:val="26"/>
+        </w:rPr>
+        <w:t>t</w:t>
+      </w:r>
+      <w:r>
+        <w:rPr>
+          <w:sz w:val="24"/>
+          <w:szCs w:val="26"/>
+          <w:vertAlign w:val="subscript"/>
+        </w:rPr>
+        <w:t>0</w:t>
+      </w:r>
+      <w:r>
+        <w:rPr>
+          <w:sz w:val="24"/>
+          <w:szCs w:val="26"/>
+        </w:rPr>
+        <w:t>=</w:t>
+      </w:r>
+      <w:r>
+        <w:t xml:space="preserve"> </w:t>
+      </w:r>
+      <w:r>
+        <w:rPr>
+          <w:sz w:val="24"/>
+        </w:rPr>
+        <w:t xml:space="preserve">87664 </w:t>
+      </w:r>
+      <w:r>
+        <w:rPr>
+          <w:sz w:val="24"/>
+          <w:szCs w:val="26"/>
+        </w:rPr>
+        <w:t>ms</w:t>
+      </w:r>
+      <w:r>
+        <w:rPr>
+          <w:sz w:val="24"/>
+          <w:szCs w:val="26"/>
+        </w:rPr>
+        <w:t xml:space="preserve">, por lo que t = </w:t>
+      </w:r>
+      <w:r>
+        <w:rPr>
+          <w:sz w:val="24"/>
+          <w:szCs w:val="26"/>
+        </w:rPr>
+        <w:t>2,</w:t>
+      </w:r>
+      <w:r>
+        <w:rPr>
+          <w:sz w:val="24"/>
+          <w:szCs w:val="26"/>
+        </w:rPr>
+        <w:t>26</w:t>
+      </w:r>
+      <w:r>
+        <w:rPr>
+          <w:sz w:val="24"/>
+          <w:szCs w:val="26"/>
+        </w:rPr>
+        <w:t>×10</w:t>
+      </w:r>
+      <w:r>
+        <w:rPr>
+          <w:sz w:val="24"/>
+          <w:szCs w:val="26"/>
+          <w:vertAlign w:val="superscript"/>
+        </w:rPr>
+        <w:t>12</w:t>
+      </w:r>
+      <w:r>
+        <w:rPr>
+          <w:sz w:val="24"/>
+          <w:szCs w:val="26"/>
+        </w:rPr>
+        <w:t xml:space="preserve"> ms</w:t>
+      </w:r>
+      <w:r>
+        <w:rPr>
+          <w:sz w:val="24"/>
+          <w:szCs w:val="26"/>
+        </w:rPr>
+        <w:t xml:space="preserve"> o aproximadamente </w:t>
+      </w:r>
+      <w:r>
+        <w:rPr>
+          <w:sz w:val="24"/>
+          <w:szCs w:val="26"/>
+        </w:rPr>
+        <w:t>26200</w:t>
+      </w:r>
+      <w:r>
+        <w:rPr>
+          <w:sz w:val="24"/>
+          <w:szCs w:val="26"/>
+        </w:rPr>
+        <w:t xml:space="preserve"> días.</w:t>
+      </w:r>
+      <w:r>
+        <w:rPr>
+          <w:sz w:val="24"/>
+          <w:szCs w:val="26"/>
+        </w:rPr>
+        <w:br/>
+      </w:r>
+    </w:p>
+    <w:p>
+      <w:pPr>
+        <w:rPr>
+          <w:sz w:val="24"/>
+          <w:szCs w:val="26"/>
+        </w:rPr>
+      </w:pPr>
+      <w:r>
+        <w:rPr>
+          <w:sz w:val="24"/>
+          <w:szCs w:val="26"/>
+        </w:rPr>
+        <w:t xml:space="preserve">Por último, para el algoritmo Rápido, con complejidad </w:t>
+      </w:r>
+      <w:proofErr w:type="gramStart"/>
+      <w:r>
+        <w:rPr>
+          <w:sz w:val="24"/>
+          <w:szCs w:val="26"/>
+        </w:rPr>
+        <w:t>O(</w:t>
+      </w:r>
+      <w:proofErr w:type="gramEnd"/>
+      <w:r>
+        <w:rPr>
+          <w:sz w:val="24"/>
+          <w:szCs w:val="26"/>
+        </w:rPr>
+        <w:t xml:space="preserve">n logn), y con </w:t>
+      </w:r>
+      <w:r>
+        <w:rPr>
+          <w:sz w:val="24"/>
+          <w:szCs w:val="26"/>
+        </w:rPr>
+        <w:t>t</w:t>
+      </w:r>
+      <w:r>
+        <w:rPr>
+          <w:sz w:val="24"/>
+          <w:szCs w:val="26"/>
+          <w:vertAlign w:val="subscript"/>
+        </w:rPr>
+        <w:t>0</w:t>
+      </w:r>
+      <w:r>
+        <w:rPr>
+          <w:sz w:val="24"/>
+          <w:szCs w:val="26"/>
+        </w:rPr>
+        <w:t>=</w:t>
+      </w:r>
+      <w:r>
+        <w:t xml:space="preserve"> </w:t>
+      </w:r>
+      <w:r>
+        <w:rPr>
+          <w:sz w:val="24"/>
+          <w:szCs w:val="26"/>
+        </w:rPr>
+        <w:t xml:space="preserve">760 </w:t>
+      </w:r>
+      <w:r>
+        <w:rPr>
+          <w:sz w:val="24"/>
+          <w:szCs w:val="26"/>
+        </w:rPr>
+        <w:t>m</w:t>
+      </w:r>
+      <w:r>
+        <w:rPr>
+          <w:sz w:val="24"/>
+          <w:szCs w:val="26"/>
+        </w:rPr>
+        <w:t>s</w:t>
+      </w:r>
+      <w:r>
+        <w:rPr>
+          <w:sz w:val="24"/>
+          <w:szCs w:val="26"/>
+        </w:rPr>
+        <w:t xml:space="preserve">, </w:t>
+      </w:r>
+    </w:p>
+    <w:p>
+      <w:pPr>
+        <w:rPr>
+          <w:sz w:val="24"/>
+          <w:szCs w:val="26"/>
+        </w:rPr>
+      </w:pPr>
+      <w:r>
+        <w:rPr>
+          <w:sz w:val="24"/>
+          <w:szCs w:val="26"/>
+        </w:rPr>
+        <w:t xml:space="preserve">t </w:t>
+      </w:r>
+      <w:r>
+        <w:rPr>
+          <w:sz w:val="24"/>
+          <w:szCs w:val="26"/>
+        </w:rPr>
+        <w:t>=</w:t>
+      </w:r>
+      <w:r>
+        <w:rPr>
+          <w:sz w:val="24"/>
+          <w:szCs w:val="26"/>
+        </w:rPr>
+        <w:t xml:space="preserve"> </w:t>
+      </w:r>
+      <w:r>
+        <w:rPr>
+          <w:sz w:val="24"/>
+          <w:szCs w:val="26"/>
+        </w:rPr>
+        <w:t>t</w:t>
+      </w:r>
+      <w:r>
+        <w:rPr>
+          <w:sz w:val="24"/>
+          <w:szCs w:val="26"/>
+          <w:vertAlign w:val="subscript"/>
+        </w:rPr>
+        <w:t>0</w:t>
+      </w:r>
+      <w:r>
+        <w:rPr>
+          <w:sz w:val="24"/>
+          <w:szCs w:val="26"/>
+        </w:rPr>
+        <w:t>​</w:t>
+      </w:r>
+      <w:r>
+        <w:rPr>
+          <w:rFonts w:ascii="Cambria Math" w:hAnsi="Cambria Math" w:cs="Cambria Math"/>
+          <w:sz w:val="24"/>
+          <w:szCs w:val="26"/>
+        </w:rPr>
+        <w:t>⋅</w:t>
+      </w:r>
+      <w:r>
+        <w:rPr>
+          <w:sz w:val="24"/>
+          <w:szCs w:val="26"/>
+        </w:rPr>
+        <w:t>k</w:t>
+      </w:r>
+      <w:r>
+        <w:rPr>
+          <w:rFonts w:ascii="Cambria Math" w:hAnsi="Cambria Math" w:cs="Cambria Math"/>
+          <w:sz w:val="24"/>
+          <w:szCs w:val="26"/>
+        </w:rPr>
+        <w:t>⋅</w:t>
+      </w:r>
+      <w:r>
+        <w:rPr>
+          <w:sz w:val="24"/>
+          <w:szCs w:val="26"/>
+        </w:rPr>
+        <w:t>logn/</w:t>
+      </w:r>
+      <w:r>
+        <w:rPr>
+          <w:rFonts w:ascii="Calibri" w:hAnsi="Calibri" w:cs="Calibri"/>
+          <w:sz w:val="24"/>
+          <w:szCs w:val="26"/>
+        </w:rPr>
+        <w:t>​</w:t>
+      </w:r>
+      <w:r>
+        <w:rPr>
+          <w:sz w:val="24"/>
+          <w:szCs w:val="26"/>
+        </w:rPr>
+        <w:t>logn</w:t>
+      </w:r>
+      <w:r>
+        <w:rPr>
+          <w:rFonts w:ascii="Calibri" w:hAnsi="Calibri" w:cs="Calibri"/>
+          <w:sz w:val="24"/>
+          <w:szCs w:val="26"/>
+        </w:rPr>
+        <w:t>​</w:t>
+      </w:r>
+      <w:r>
+        <w:rPr>
+          <w:rFonts w:ascii="Calibri" w:hAnsi="Calibri" w:cs="Calibri"/>
+          <w:sz w:val="24"/>
+          <w:szCs w:val="26"/>
+          <w:vertAlign w:val="subscript"/>
+        </w:rPr>
+        <w:t>0</w:t>
+      </w:r>
+      <w:r>
+        <w:rPr>
+          <w:rFonts w:ascii="Calibri" w:hAnsi="Calibri" w:cs="Calibri"/>
+          <w:sz w:val="24"/>
+          <w:szCs w:val="26"/>
+          <w:vertAlign w:val="subscript"/>
+        </w:rPr>
+        <w:t xml:space="preserve"> </w:t>
+      </w:r>
+      <w:r>
+        <w:rPr>
+          <w:rFonts w:ascii="Calibri" w:hAnsi="Calibri" w:cs="Calibri"/>
+          <w:sz w:val="24"/>
+          <w:szCs w:val="26"/>
+        </w:rPr>
+        <w:t xml:space="preserve">por lo que t = 760 · 5074.5 · </w:t>
+      </w:r>
+      <w:r>
+        <w:rPr>
+          <w:rFonts w:ascii="Calibri" w:hAnsi="Calibri" w:cs="Calibri"/>
+          <w:sz w:val="24"/>
+          <w:szCs w:val="26"/>
+        </w:rPr>
+        <w:t>1.42</w:t>
+      </w:r>
+      <w:r>
+        <w:rPr>
+          <w:rFonts w:ascii="Calibri" w:hAnsi="Calibri" w:cs="Calibri"/>
+          <w:sz w:val="24"/>
+          <w:szCs w:val="26"/>
+        </w:rPr>
+        <w:t xml:space="preserve"> = 5,</w:t>
+      </w:r>
+      <w:r>
+        <w:rPr>
+          <w:rFonts w:ascii="Calibri" w:hAnsi="Calibri" w:cs="Calibri"/>
+          <w:sz w:val="24"/>
+          <w:szCs w:val="26"/>
+        </w:rPr>
+        <w:t>48×10</w:t>
+      </w:r>
+      <w:r>
+        <w:rPr>
+          <w:rFonts w:ascii="Calibri" w:hAnsi="Calibri" w:cs="Calibri"/>
+          <w:sz w:val="24"/>
+          <w:szCs w:val="26"/>
+          <w:vertAlign w:val="superscript"/>
+        </w:rPr>
+        <w:t>6</w:t>
+      </w:r>
+      <w:r>
+        <w:rPr>
+          <w:rFonts w:ascii="Calibri" w:hAnsi="Calibri" w:cs="Calibri"/>
+          <w:sz w:val="24"/>
+          <w:szCs w:val="26"/>
+        </w:rPr>
+        <w:t xml:space="preserve"> ms</w:t>
+      </w:r>
+      <w:r>
+        <w:rPr>
+          <w:rFonts w:ascii="Calibri" w:hAnsi="Calibri" w:cs="Calibri"/>
+          <w:sz w:val="24"/>
+          <w:szCs w:val="26"/>
+        </w:rPr>
+        <w:t xml:space="preserve"> o 0,064 días.</w:t>
+      </w:r>
+      <w:bookmarkStart w:id="0" w:name="_GoBack"/>
+      <w:bookmarkEnd w:id="0"/>
     </w:p>
     <w:p>
       <w:pPr>
@@ -11998,6 +12897,7 @@
                 <w:sz w:val="26"/>
                 <w:szCs w:val="26"/>
               </w:rPr>
+              <w:lastRenderedPageBreak/>
               <w:t>10</w:t>
             </w:r>
           </w:p>
@@ -12718,15 +13618,7 @@
                 <w:sz w:val="26"/>
                 <w:szCs w:val="26"/>
               </w:rPr>
-              <w:t>5</w:t>
-            </w:r>
-            <w:r>
-              <w:rPr>
-                <w:color w:val="4472C4" w:themeColor="accent5"/>
-                <w:sz w:val="26"/>
-                <w:szCs w:val="26"/>
-              </w:rPr>
-              <w:t>0</w:t>
+              <w:t>50</w:t>
             </w:r>
           </w:p>
         </w:tc>
@@ -12816,15 +13708,7 @@
                 <w:sz w:val="26"/>
                 <w:szCs w:val="26"/>
               </w:rPr>
-              <w:t>5</w:t>
-            </w:r>
-            <w:r>
-              <w:rPr>
-                <w:color w:val="4472C4" w:themeColor="accent5"/>
-                <w:sz w:val="26"/>
-                <w:szCs w:val="26"/>
-              </w:rPr>
-              <w:t>5</w:t>
+              <w:t>55</w:t>
             </w:r>
           </w:p>
         </w:tc>
@@ -12914,15 +13798,7 @@
                 <w:sz w:val="26"/>
                 <w:szCs w:val="26"/>
               </w:rPr>
-              <w:t>6</w:t>
-            </w:r>
-            <w:r>
-              <w:rPr>
-                <w:color w:val="4472C4" w:themeColor="accent5"/>
-                <w:sz w:val="26"/>
-                <w:szCs w:val="26"/>
-              </w:rPr>
-              <w:t>0</w:t>
+              <w:t>60</w:t>
             </w:r>
           </w:p>
         </w:tc>
@@ -13012,15 +13888,7 @@
                 <w:sz w:val="26"/>
                 <w:szCs w:val="26"/>
               </w:rPr>
-              <w:t>6</w:t>
-            </w:r>
-            <w:r>
-              <w:rPr>
-                <w:color w:val="4472C4" w:themeColor="accent5"/>
-                <w:sz w:val="26"/>
-                <w:szCs w:val="26"/>
-              </w:rPr>
-              <w:t>5</w:t>
+              <w:t>65</w:t>
             </w:r>
           </w:p>
         </w:tc>
@@ -13110,15 +13978,7 @@
                 <w:sz w:val="26"/>
                 <w:szCs w:val="26"/>
               </w:rPr>
-              <w:t>7</w:t>
-            </w:r>
-            <w:r>
-              <w:rPr>
-                <w:color w:val="4472C4" w:themeColor="accent5"/>
-                <w:sz w:val="26"/>
-                <w:szCs w:val="26"/>
-              </w:rPr>
-              <w:t>0</w:t>
+              <w:t>70</w:t>
             </w:r>
           </w:p>
         </w:tc>
@@ -13208,15 +14068,7 @@
                 <w:sz w:val="26"/>
                 <w:szCs w:val="26"/>
               </w:rPr>
-              <w:t>7</w:t>
-            </w:r>
-            <w:r>
-              <w:rPr>
-                <w:color w:val="4472C4" w:themeColor="accent5"/>
-                <w:sz w:val="26"/>
-                <w:szCs w:val="26"/>
-              </w:rPr>
-              <w:t>5</w:t>
+              <w:t>75</w:t>
             </w:r>
           </w:p>
         </w:tc>
@@ -13306,15 +14158,7 @@
                 <w:sz w:val="26"/>
                 <w:szCs w:val="26"/>
               </w:rPr>
-              <w:t>8</w:t>
-            </w:r>
-            <w:r>
-              <w:rPr>
-                <w:color w:val="4472C4" w:themeColor="accent5"/>
-                <w:sz w:val="26"/>
-                <w:szCs w:val="26"/>
-              </w:rPr>
-              <w:t>0</w:t>
+              <w:t>80</w:t>
             </w:r>
           </w:p>
         </w:tc>
@@ -13404,15 +14248,7 @@
                 <w:sz w:val="26"/>
                 <w:szCs w:val="26"/>
               </w:rPr>
-              <w:t>8</w:t>
-            </w:r>
-            <w:r>
-              <w:rPr>
-                <w:color w:val="4472C4" w:themeColor="accent5"/>
-                <w:sz w:val="26"/>
-                <w:szCs w:val="26"/>
-              </w:rPr>
-              <w:t>5</w:t>
+              <w:t>85</w:t>
             </w:r>
           </w:p>
         </w:tc>
@@ -13502,15 +14338,7 @@
                 <w:sz w:val="26"/>
                 <w:szCs w:val="26"/>
               </w:rPr>
-              <w:t>9</w:t>
-            </w:r>
-            <w:r>
-              <w:rPr>
-                <w:color w:val="4472C4" w:themeColor="accent5"/>
-                <w:sz w:val="26"/>
-                <w:szCs w:val="26"/>
-              </w:rPr>
-              <w:t>0</w:t>
+              <w:t>90</w:t>
             </w:r>
           </w:p>
         </w:tc>
@@ -13600,15 +14428,7 @@
                 <w:sz w:val="26"/>
                 <w:szCs w:val="26"/>
               </w:rPr>
-              <w:t>9</w:t>
-            </w:r>
-            <w:r>
-              <w:rPr>
-                <w:color w:val="4472C4" w:themeColor="accent5"/>
-                <w:sz w:val="26"/>
-                <w:szCs w:val="26"/>
-              </w:rPr>
-              <w:t>5</w:t>
+              <w:t>95</w:t>
             </w:r>
           </w:p>
         </w:tc>
@@ -13698,15 +14518,7 @@
                 <w:sz w:val="26"/>
                 <w:szCs w:val="26"/>
               </w:rPr>
-              <w:t>10</w:t>
-            </w:r>
-            <w:r>
-              <w:rPr>
-                <w:color w:val="4472C4" w:themeColor="accent5"/>
-                <w:sz w:val="26"/>
-                <w:szCs w:val="26"/>
-              </w:rPr>
-              <w:t>0</w:t>
+              <w:t>100</w:t>
             </w:r>
           </w:p>
         </w:tc>
@@ -13782,8 +14594,8 @@
       <w:pPr>
         <w:rPr>
           <w:b/>
-          <w:sz w:val="26"/>
-          <w:szCs w:val="26"/>
+          <w:sz w:val="2"/>
+          <w:szCs w:val="2"/>
         </w:rPr>
       </w:pPr>
     </w:p>
@@ -13831,6 +14643,152 @@
     <w:p>
       <w:pPr>
         <w:rPr>
+          <w:sz w:val="24"/>
+          <w:szCs w:val="26"/>
+        </w:rPr>
+      </w:pPr>
+      <w:r>
+        <w:rPr>
+          <w:sz w:val="24"/>
+          <w:szCs w:val="26"/>
+        </w:rPr>
+        <w:t xml:space="preserve">El algoritmo rápido comenzará a tardar menos tiempo que el de inserción para valores de n suficientemente grandes. </w:t>
+      </w:r>
+      <w:r>
+        <w:rPr>
+          <w:sz w:val="24"/>
+          <w:szCs w:val="26"/>
+        </w:rPr>
+        <w:t>En</w:t>
+      </w:r>
+      <w:r>
+        <w:rPr>
+          <w:sz w:val="24"/>
+          <w:szCs w:val="26"/>
+        </w:rPr>
+        <w:t xml:space="preserve"> la tabla la relación de tiempos disminuye progresivamente, lo que concuerda con que rápido tiene complejidad </w:t>
+      </w:r>
+      <w:proofErr w:type="gramStart"/>
+      <w:r>
+        <w:rPr>
+          <w:sz w:val="24"/>
+          <w:szCs w:val="26"/>
+        </w:rPr>
+        <w:t>O(</w:t>
+      </w:r>
+      <w:proofErr w:type="gramEnd"/>
+      <w:r>
+        <w:rPr>
+          <w:sz w:val="24"/>
+          <w:szCs w:val="26"/>
+        </w:rPr>
+        <w:t>n logn) frente a O(n</w:t>
+      </w:r>
+      <w:r>
+        <w:rPr>
+          <w:sz w:val="24"/>
+          <w:szCs w:val="26"/>
+          <w:vertAlign w:val="superscript"/>
+        </w:rPr>
+        <w:t>2</w:t>
+      </w:r>
+      <w:r>
+        <w:rPr>
+          <w:sz w:val="24"/>
+          <w:szCs w:val="26"/>
+        </w:rPr>
+        <w:t xml:space="preserve">) </w:t>
+      </w:r>
+      <w:r>
+        <w:rPr>
+          <w:sz w:val="24"/>
+          <w:szCs w:val="26"/>
+        </w:rPr>
+        <w:t xml:space="preserve">de inserción. </w:t>
+      </w:r>
+      <w:r>
+        <w:rPr>
+          <w:sz w:val="24"/>
+          <w:szCs w:val="26"/>
+        </w:rPr>
+        <w:t>Como para un n = 10, la relación de rápido e inserción es 7,27 y para un n = 100 la relación es 2,76 y calculamos como avanza la ejecución, por lo que el algoritmo rápido tendrá tiempos menores que el de inserción para un n = 280, ya que habría que multiplicar el tiempo del algoritmo rápido por 2,8 más o menos, lo que darían 5485 ms, y el tiempo de inserción lo habría que multiplicar por 2,8</w:t>
+      </w:r>
+      <w:r>
+        <w:rPr>
+          <w:sz w:val="24"/>
+          <w:szCs w:val="26"/>
+          <w:vertAlign w:val="superscript"/>
+        </w:rPr>
+        <w:t>2</w:t>
+      </w:r>
+      <w:r>
+        <w:rPr>
+          <w:sz w:val="24"/>
+          <w:szCs w:val="26"/>
+        </w:rPr>
+        <w:t xml:space="preserve"> (ya que es cuadrático), lo que darían unos 5574 ms.</w:t>
+      </w:r>
+    </w:p>
+    <w:p>
+      <w:pPr>
+        <w:rPr>
+          <w:b/>
+          <w:sz w:val="26"/>
+          <w:szCs w:val="26"/>
+        </w:rPr>
+      </w:pPr>
+      <w:r>
+        <w:rPr>
+          <w:b/>
+          <w:sz w:val="26"/>
+          <w:szCs w:val="26"/>
+        </w:rPr>
+        <w:t>A</w:t>
+      </w:r>
+      <w:r>
+        <w:rPr>
+          <w:b/>
+          <w:sz w:val="26"/>
+          <w:szCs w:val="26"/>
+        </w:rPr>
+        <w:t xml:space="preserve"> partir </w:t>
+      </w:r>
+      <w:r>
+        <w:rPr>
+          <w:b/>
+          <w:sz w:val="26"/>
+          <w:szCs w:val="26"/>
+        </w:rPr>
+        <w:t xml:space="preserve">del análisis de los resultados </w:t>
+      </w:r>
+      <w:r>
+        <w:rPr>
+          <w:b/>
+          <w:sz w:val="26"/>
+          <w:szCs w:val="26"/>
+        </w:rPr>
+        <w:t xml:space="preserve">obtenidos en el apartado anterior, </w:t>
+      </w:r>
+      <w:r>
+        <w:rPr>
+          <w:b/>
+          <w:sz w:val="26"/>
+          <w:szCs w:val="26"/>
+        </w:rPr>
+        <w:t xml:space="preserve">puede diseñar e implementar un </w:t>
+      </w:r>
+      <w:r>
+        <w:rPr>
+          <w:b/>
+          <w:sz w:val="26"/>
+          <w:szCs w:val="26"/>
+        </w:rPr>
+        <w:t>algoritmo que combine el método rápido con el método inserción, teniendo como objetivo bajar los tiempos obtenidos por el rápido y reflejados en la TABLA4.</w:t>
+      </w:r>
+    </w:p>
+    <w:p>
+      <w:pPr>
+        <w:rPr>
           <w:b/>
           <w:sz w:val="26"/>
           <w:szCs w:val="26"/>
@@ -13851,72 +14809,6 @@
           <w:sz w:val="26"/>
           <w:szCs w:val="26"/>
         </w:rPr>
-        <w:t>A</w:t>
-      </w:r>
-      <w:r>
-        <w:rPr>
-          <w:b/>
-          <w:sz w:val="26"/>
-          <w:szCs w:val="26"/>
-        </w:rPr>
-        <w:t xml:space="preserve"> partir </w:t>
-      </w:r>
-      <w:r>
-        <w:rPr>
-          <w:b/>
-          <w:sz w:val="26"/>
-          <w:szCs w:val="26"/>
-        </w:rPr>
-        <w:t xml:space="preserve">del análisis de los resultados </w:t>
-      </w:r>
-      <w:r>
-        <w:rPr>
-          <w:b/>
-          <w:sz w:val="26"/>
-          <w:szCs w:val="26"/>
-        </w:rPr>
-        <w:t xml:space="preserve">obtenidos en el apartado anterior, </w:t>
-      </w:r>
-      <w:r>
-        <w:rPr>
-          <w:b/>
-          <w:sz w:val="26"/>
-          <w:szCs w:val="26"/>
-        </w:rPr>
-        <w:t xml:space="preserve">puede diseñar e implementar un </w:t>
-      </w:r>
-      <w:r>
-        <w:rPr>
-          <w:b/>
-          <w:sz w:val="26"/>
-          <w:szCs w:val="26"/>
-        </w:rPr>
-        <w:t>algoritmo que combine el método rápido con el método inserción, teniendo como objetivo bajar los tiempos obtenidos por el rápido y reflejados en la TABLA4.</w:t>
-      </w:r>
-    </w:p>
-    <w:p>
-      <w:pPr>
-        <w:rPr>
-          <w:b/>
-          <w:sz w:val="26"/>
-          <w:szCs w:val="26"/>
-        </w:rPr>
-      </w:pPr>
-    </w:p>
-    <w:p>
-      <w:pPr>
-        <w:rPr>
-          <w:b/>
-          <w:sz w:val="26"/>
-          <w:szCs w:val="26"/>
-        </w:rPr>
-      </w:pPr>
-      <w:r>
-        <w:rPr>
-          <w:b/>
-          <w:sz w:val="26"/>
-          <w:szCs w:val="26"/>
-        </w:rPr>
         <w:t xml:space="preserve">Calcular los tiempos del algoritmo </w:t>
       </w:r>
       <w:r>
@@ -13943,8 +14835,6 @@
         </w:rPr>
         <w:t xml:space="preserve">o en qué grado se consiguió el </w:t>
       </w:r>
-      <w:bookmarkStart w:id="0" w:name="_GoBack"/>
-      <w:bookmarkEnd w:id="0"/>
       <w:r>
         <w:rPr>
           <w:b/>
@@ -14357,7 +15247,7 @@
   <w:style w:type="paragraph" w:default="1" w:styleId="Normal">
     <w:name w:val="Normal"/>
     <w:qFormat/>
-    <w:rsid w:val="00621B98"/>
+    <w:rsid w:val="001333D3"/>
   </w:style>
   <w:style w:type="character" w:default="1" w:styleId="Fuentedeprrafopredeter">
     <w:name w:val="Default Paragraph Font"/>
@@ -14697,7 +15587,7 @@
 </file>
 
 <file path=customXml/itemProps1.xml><?xml version="1.0" encoding="utf-8"?>
-<ds:datastoreItem xmlns:ds="http://schemas.openxmlformats.org/officeDocument/2006/customXml" ds:itemID="{54152622-466F-46C2-BDDA-76BE103FA538}">
+<ds:datastoreItem xmlns:ds="http://schemas.openxmlformats.org/officeDocument/2006/customXml" ds:itemID="{6CAD9A56-F991-4E15-9AC8-9FD7767A4C11}">
   <ds:schemaRefs>
     <ds:schemaRef ds:uri="http://schemas.openxmlformats.org/officeDocument/2006/bibliography"/>
   </ds:schemaRefs>

</xml_diff>